<commit_message>
OPS: Tankvakt → TankGuard (helt engelskt namn), hello@, SE + NO standard
Axels regler 2026-09-08: (1) brandnamnet ska vara helt engelskt — Tankvakt
avvisat, brand-steget gjort om: butiker/tankguard.yaml, produkt-fil,
logga/favicon-SVG, state, checklista. tankguard.se + tankguard.no lediga i
DNS (.com upptagen, behövs inte). (2) supportmail hello@tankguard.se.
(3) butik.marknader med Norge (nb, NOK) från start.

va-checklist-docx.mjs läser nu stegen ur VA-CHECKLIST.md i stället för
hårdkodad text — Word-filen kan inte glida ifrån Axels mall (verifierat
36/36 rader, XSD grönt). Dry-run grön: break-even-ROAS 1,53, tema-QA grön,
två väntade varningar (page_id/pixel_id).

Co-Authored-By: Claude Fable 5.1 <noreply@anthropic.com>
Claude-Session: https://claude.ai/code/session_01H5seEmtgVGesSppzndPVkM
</commit_message>
<xml_diff>
--- a/factory/VA-CHECKLIST.docx
+++ b/factory/VA-CHECKLIST.docx
@@ -525,7 +525,7 @@
             <w:pPr>
               <w:spacing w:after="0"/>
             </w:pPr>
-            <w:hyperlink w:history="1" r:id="rIdotin0hplrmdvz6lxq_r7l">
+            <w:hyperlink w:history="1" r:id="rIdpf3cyxege9onyffcpriii">
               <w:r>
                 <w:rPr>
                   <w:rFonts w:ascii="Arial" w:cs="Arial" w:eastAsia="Arial" w:hAnsi="Arial"/>
@@ -731,6 +731,71 @@
                 <w:szCs w:val="22"/>
               </w:rPr>
               <w:t xml:space="preserve">Swedish</w:t>
+            </w:r>
+          </w:p>
+        </w:tc>
+      </w:tr>
+      <w:tr>
+        <w:tc>
+          <w:tcPr>
+            <w:tcW w:type="dxa" w:w="3400"/>
+            <w:tcBorders>
+              <w:top w:val="single" w:color="BBBBBB" w:sz="4"/>
+              <w:left w:val="single" w:color="BBBBBB" w:sz="4"/>
+              <w:bottom w:val="single" w:color="BBBBBB" w:sz="4"/>
+              <w:right w:val="single" w:color="BBBBBB" w:sz="4"/>
+            </w:tcBorders>
+            <w:shd w:fill="F4F2EC" w:color="auto" w:val="clear"/>
+            <w:tcMar>
+              <w:top w:type="dxa" w:w="60"/>
+              <w:left w:type="dxa" w:w="100"/>
+              <w:bottom w:type="dxa" w:w="60"/>
+              <w:right w:type="dxa" w:w="100"/>
+            </w:tcMar>
+          </w:tcPr>
+          <w:p>
+            <w:pPr>
+              <w:spacing w:after="0"/>
+            </w:pPr>
+            <w:r>
+              <w:rPr>
+                <w:rFonts w:ascii="Arial" w:cs="Arial" w:eastAsia="Arial" w:hAnsi="Arial"/>
+                <w:b/>
+                <w:bCs/>
+                <w:sz w:val="22"/>
+                <w:szCs w:val="22"/>
+              </w:rPr>
+              <w:t xml:space="preserve">Markets</w:t>
+            </w:r>
+          </w:p>
+        </w:tc>
+        <w:tc>
+          <w:tcPr>
+            <w:tcW w:type="dxa" w:w="6000"/>
+            <w:tcBorders>
+              <w:top w:val="single" w:color="BBBBBB" w:sz="4"/>
+              <w:left w:val="single" w:color="BBBBBB" w:sz="4"/>
+              <w:bottom w:val="single" w:color="BBBBBB" w:sz="4"/>
+              <w:right w:val="single" w:color="BBBBBB" w:sz="4"/>
+            </w:tcBorders>
+            <w:tcMar>
+              <w:top w:type="dxa" w:w="60"/>
+              <w:left w:type="dxa" w:w="100"/>
+              <w:bottom w:type="dxa" w:w="60"/>
+              <w:right w:type="dxa" w:w="100"/>
+            </w:tcMar>
+          </w:tcPr>
+          <w:p>
+            <w:pPr>
+              <w:spacing w:after="0"/>
+            </w:pPr>
+            <w:r>
+              <w:rPr>
+                <w:rFonts w:ascii="Arial" w:cs="Arial" w:eastAsia="Arial" w:hAnsi="Arial"/>
+                <w:sz w:val="22"/>
+                <w:szCs w:val="22"/>
+              </w:rPr>
+              <w:t xml:space="preserve">Sweden + Norway (every store)</w:t>
             </w:r>
           </w:p>
         </w:tc>
@@ -959,7 +1024,7 @@
                 <w:sz w:val="22"/>
                 <w:szCs w:val="22"/>
               </w:rPr>
-              <w:t xml:space="preserve">____________________</w:t>
+              <w:t xml:space="preserve">____________</w:t>
             </w:r>
           </w:p>
         </w:tc>
@@ -1024,7 +1089,7 @@
                 <w:sz w:val="22"/>
                 <w:szCs w:val="22"/>
               </w:rPr>
-              <w:t xml:space="preserve">____________________  (e.g. brand.se)</w:t>
+              <w:t xml:space="preserve">____________ (e.g. brand.se)</w:t>
             </w:r>
           </w:p>
         </w:tc>
@@ -1089,7 +1154,7 @@
                 <w:sz w:val="22"/>
                 <w:szCs w:val="22"/>
               </w:rPr>
-              <w:t xml:space="preserve">hej@DOMAIN</w:t>
+              <w:t xml:space="preserve">hello@DOMAIN</w:t>
             </w:r>
           </w:p>
         </w:tc>
@@ -1204,7 +1269,7 @@
         </w:rPr>
         <w:t xml:space="preserve">VIDEO: </w:t>
       </w:r>
-      <w:hyperlink w:history="1" r:id="rIdn9eo4zp8ez6727zwjj-qq">
+      <w:hyperlink w:history="1" r:id="rIdtue_yjs6q86cmmh0adnqp">
         <w:r>
           <w:rPr>
             <w:rFonts w:ascii="Arial" w:cs="Arial" w:eastAsia="Arial" w:hAnsi="Arial"/>
@@ -1330,7 +1395,7 @@
         </w:rPr>
         <w:t xml:space="preserve">VIDEO: </w:t>
       </w:r>
-      <w:hyperlink w:history="1" r:id="rIdtltnqloigyc2ouojy-pg6">
+      <w:hyperlink w:history="1" r:id="rIdqjdbqcpune6rra9n9uk6p">
         <w:r>
           <w:rPr>
             <w:rFonts w:ascii="Arial" w:cs="Arial" w:eastAsia="Arial" w:hAnsi="Arial"/>
@@ -1388,22 +1453,18 @@
     <w:p>
       <w:pPr>
         <w:spacing w:after="80"/>
-      </w:pPr>
-      <w:r>
-        <w:rPr>
-          <w:rFonts w:ascii="Arial" w:cs="Arial" w:eastAsia="Arial" w:hAnsi="Arial"/>
-          <w:sz w:val="22"/>
-          <w:szCs w:val="22"/>
-        </w:rPr>
-        <w:t xml:space="preserve">☐  </w:t>
-      </w:r>
-      <w:r>
-        <w:rPr>
-          <w:rFonts w:ascii="Arial" w:cs="Arial" w:eastAsia="Arial" w:hAnsi="Arial"/>
-          <w:sz w:val="22"/>
-          <w:szCs w:val="22"/>
-        </w:rPr>
-        <w:t xml:space="preserve">(Staff invites need a paid plan – the owner is added at hand over instead)</w:t>
+        <w:ind w:left="420"/>
+      </w:pPr>
+      <w:r>
+        <w:rPr>
+          <w:rFonts w:ascii="Arial" w:cs="Arial" w:eastAsia="Arial" w:hAnsi="Arial"/>
+          <w:i/>
+          <w:iCs/>
+          <w:color w:val="555555"/>
+          <w:sz w:val="22"/>
+          <w:szCs w:val="22"/>
+        </w:rPr>
+        <w:t xml:space="preserve">Note: staff invites need a paid plan – the owner is added at hand over.</w:t>
       </w:r>
     </w:p>
     <w:p>
@@ -1483,7 +1544,7 @@
           <w:sz w:val="22"/>
           <w:szCs w:val="22"/>
         </w:rPr>
-        <w:t xml:space="preserve">Settings → Languages → make Swedish default (add others if needed)</w:t>
+        <w:t xml:space="preserve">Settings → Languages → make Swedish default</w:t>
       </w:r>
     </w:p>
     <w:p>
@@ -1963,7 +2024,7 @@
           <w:sz w:val="22"/>
           <w:szCs w:val="22"/>
         </w:rPr>
-        <w:t xml:space="preserve">Tell Claude Code: "Store ready: STORE NAME" – it creates the pixel, renames the ad account, builds Discord channels and imports reviews</w:t>
+        <w:t xml:space="preserve">Tell Claude Code: "Store ready: STORE NAME" – it creates the pixel, builds Discord channels and imports reviews</w:t>
       </w:r>
     </w:p>
     <w:p>
@@ -2005,7 +2066,70 @@
           <w:sz w:val="22"/>
           <w:szCs w:val="22"/>
         </w:rPr>
-        <w:t xml:space="preserve">Install the WeTracked app → paste the pixel ID Claude gives you → connect the Conversions API token (follow WeTracked's guide)</w:t>
+        <w:t xml:space="preserve">When Claude says the Norway market is ready: Settings → Markets → Norway → activate NOK → Save</w:t>
+      </w:r>
+    </w:p>
+    <w:p>
+      <w:pPr>
+        <w:spacing w:after="80"/>
+      </w:pPr>
+      <w:r>
+        <w:rPr>
+          <w:rFonts w:ascii="Arial" w:cs="Arial" w:eastAsia="Arial" w:hAnsi="Arial"/>
+          <w:sz w:val="22"/>
+          <w:szCs w:val="22"/>
+        </w:rPr>
+        <w:t xml:space="preserve">☐  </w:t>
+      </w:r>
+      <w:r>
+        <w:rPr>
+          <w:rFonts w:ascii="Arial" w:cs="Arial" w:eastAsia="Arial" w:hAnsi="Arial"/>
+          <w:sz w:val="22"/>
+          <w:szCs w:val="22"/>
+        </w:rPr>
+        <w:t xml:space="preserve">Install the WeTracked app from the Shopify App Store</w:t>
+      </w:r>
+    </w:p>
+    <w:p>
+      <w:pPr>
+        <w:spacing w:after="80"/>
+      </w:pPr>
+      <w:r>
+        <w:rPr>
+          <w:rFonts w:ascii="Arial" w:cs="Arial" w:eastAsia="Arial" w:hAnsi="Arial"/>
+          <w:sz w:val="22"/>
+          <w:szCs w:val="22"/>
+        </w:rPr>
+        <w:t xml:space="preserve">☐  </w:t>
+      </w:r>
+      <w:r>
+        <w:rPr>
+          <w:rFonts w:ascii="Arial" w:cs="Arial" w:eastAsia="Arial" w:hAnsi="Arial"/>
+          <w:sz w:val="22"/>
+          <w:szCs w:val="22"/>
+        </w:rPr>
+        <w:t xml:space="preserve">WeTracked → paste the pixel ID Claude gives you</w:t>
+      </w:r>
+    </w:p>
+    <w:p>
+      <w:pPr>
+        <w:spacing w:after="80"/>
+      </w:pPr>
+      <w:r>
+        <w:rPr>
+          <w:rFonts w:ascii="Arial" w:cs="Arial" w:eastAsia="Arial" w:hAnsi="Arial"/>
+          <w:sz w:val="22"/>
+          <w:szCs w:val="22"/>
+        </w:rPr>
+        <w:t xml:space="preserve">☐  </w:t>
+      </w:r>
+      <w:r>
+        <w:rPr>
+          <w:rFonts w:ascii="Arial" w:cs="Arial" w:eastAsia="Arial" w:hAnsi="Arial"/>
+          <w:sz w:val="22"/>
+          <w:szCs w:val="22"/>
+        </w:rPr>
+        <w:t xml:space="preserve">WeTracked → connect the Conversions API token (WeTracked shows the steps)</w:t>
       </w:r>
     </w:p>
     <w:p>
@@ -2097,7 +2221,7 @@
           <w:sz w:val="20"/>
           <w:szCs w:val="20"/>
         </w:rPr>
-        <w:t xml:space="preserve">Claude Code does: brand design from product + audience, theme build, product page, bundles + free-gift bonus, cart upsell, images, reviews import, Meta pixel, ad account rename, Discord channels, markets/translations, and tells you exactly when your clicks are needed.</w:t>
+        <w:t xml:space="preserve">Claude Code does: brand design from product + audience, theme build, product page, bundles + free-gift bonus, cart upsell, images, reviews import, Meta pixel, Discord channels, markets/translations, and tells you exactly when your clicks are needed.</w:t>
       </w:r>
     </w:p>
     <w:sectPr>

</xml_diff>